<commit_message>
Agregación de una nota en un caso de uso del documento
</commit_message>
<xml_diff>
--- a/docs/DocumentoCompleto.docx
+++ b/docs/DocumentoCompleto.docx
@@ -1819,12 +1819,12 @@
           <wp:inline distB="114300" distT="114300" distL="114300" distR="114300">
             <wp:extent cx="3533775" cy="2207497"/>
             <wp:effectExtent b="0" l="0" r="0" t="0"/>
-            <wp:docPr id="4" name="image5.png"/>
+            <wp:docPr id="4" name="image6.png"/>
             <a:graphic>
               <a:graphicData uri="http://schemas.openxmlformats.org/drawingml/2006/picture">
                 <pic:pic>
                   <pic:nvPicPr>
-                    <pic:cNvPr id="0" name="image5.png"/>
+                    <pic:cNvPr id="0" name="image6.png"/>
                     <pic:cNvPicPr preferRelativeResize="0"/>
                   </pic:nvPicPr>
                   <pic:blipFill>
@@ -3309,12 +3309,12 @@
           <wp:inline distB="114300" distT="114300" distL="114300" distR="114300">
             <wp:extent cx="4684151" cy="3279887"/>
             <wp:effectExtent b="0" l="0" r="0" t="0"/>
-            <wp:docPr id="8" name="image30.png"/>
+            <wp:docPr id="8" name="image29.png"/>
             <a:graphic>
               <a:graphicData uri="http://schemas.openxmlformats.org/drawingml/2006/picture">
                 <pic:pic>
                   <pic:nvPicPr>
-                    <pic:cNvPr id="0" name="image30.png"/>
+                    <pic:cNvPr id="0" name="image29.png"/>
                     <pic:cNvPicPr preferRelativeResize="0"/>
                   </pic:nvPicPr>
                   <pic:blipFill>
@@ -5266,12 +5266,12 @@
           <wp:inline distB="114300" distT="114300" distL="114300" distR="114300">
             <wp:extent cx="2783235" cy="4400662"/>
             <wp:effectExtent b="0" l="0" r="0" t="0"/>
-            <wp:docPr id="22" name="image22.png"/>
+            <wp:docPr id="22" name="image25.png"/>
             <a:graphic>
               <a:graphicData uri="http://schemas.openxmlformats.org/drawingml/2006/picture">
                 <pic:pic>
                   <pic:nvPicPr>
-                    <pic:cNvPr id="0" name="image22.png"/>
+                    <pic:cNvPr id="0" name="image25.png"/>
                     <pic:cNvPicPr preferRelativeResize="0"/>
                   </pic:nvPicPr>
                   <pic:blipFill>
@@ -5448,12 +5448,12 @@
           <wp:inline distB="114300" distT="114300" distL="114300" distR="114300">
             <wp:extent cx="3657600" cy="1257300"/>
             <wp:effectExtent b="0" l="0" r="0" t="0"/>
-            <wp:docPr id="12" name="image6.png"/>
+            <wp:docPr id="12" name="image9.png"/>
             <a:graphic>
               <a:graphicData uri="http://schemas.openxmlformats.org/drawingml/2006/picture">
                 <pic:pic>
                   <pic:nvPicPr>
-                    <pic:cNvPr id="0" name="image6.png"/>
+                    <pic:cNvPr id="0" name="image9.png"/>
                     <pic:cNvPicPr preferRelativeResize="0"/>
                   </pic:nvPicPr>
                   <pic:blipFill>
@@ -7087,12 +7087,12 @@
           <wp:inline distB="114300" distT="114300" distL="114300" distR="114300">
             <wp:extent cx="3676650" cy="3157234"/>
             <wp:effectExtent b="0" l="0" r="0" t="0"/>
-            <wp:docPr id="15" name="image20.png"/>
+            <wp:docPr id="15" name="image15.png"/>
             <a:graphic>
               <a:graphicData uri="http://schemas.openxmlformats.org/drawingml/2006/picture">
                 <pic:pic>
                   <pic:nvPicPr>
-                    <pic:cNvPr id="0" name="image20.png"/>
+                    <pic:cNvPr id="0" name="image15.png"/>
                     <pic:cNvPicPr preferRelativeResize="0"/>
                   </pic:nvPicPr>
                   <pic:blipFill>
@@ -7403,12 +7403,12 @@
           <wp:inline distB="114300" distT="114300" distL="114300" distR="114300">
             <wp:extent cx="2590800" cy="1531257"/>
             <wp:effectExtent b="0" l="0" r="0" t="0"/>
-            <wp:docPr id="27" name="image13.png"/>
+            <wp:docPr id="27" name="image16.png"/>
             <a:graphic>
               <a:graphicData uri="http://schemas.openxmlformats.org/drawingml/2006/picture">
                 <pic:pic>
                   <pic:nvPicPr>
-                    <pic:cNvPr id="0" name="image13.png"/>
+                    <pic:cNvPr id="0" name="image16.png"/>
                     <pic:cNvPicPr preferRelativeResize="0"/>
                   </pic:nvPicPr>
                   <pic:blipFill>
@@ -8349,12 +8349,12 @@
           <wp:inline distB="114300" distT="114300" distL="114300" distR="114300">
             <wp:extent cx="4829175" cy="3058173"/>
             <wp:effectExtent b="0" l="0" r="0" t="0"/>
-            <wp:docPr id="33" name="image29.png"/>
+            <wp:docPr id="33" name="image30.png"/>
             <a:graphic>
               <a:graphicData uri="http://schemas.openxmlformats.org/drawingml/2006/picture">
                 <pic:pic>
                   <pic:nvPicPr>
-                    <pic:cNvPr id="0" name="image29.png"/>
+                    <pic:cNvPr id="0" name="image30.png"/>
                     <pic:cNvPicPr preferRelativeResize="0"/>
                   </pic:nvPicPr>
                   <pic:blipFill>
@@ -8548,12 +8548,12 @@
           <wp:inline distB="114300" distT="114300" distL="114300" distR="114300">
             <wp:extent cx="2948804" cy="1695562"/>
             <wp:effectExtent b="0" l="0" r="0" t="0"/>
-            <wp:docPr id="24" name="image11.png"/>
+            <wp:docPr id="24" name="image12.png"/>
             <a:graphic>
               <a:graphicData uri="http://schemas.openxmlformats.org/drawingml/2006/picture">
                 <pic:pic>
                   <pic:nvPicPr>
-                    <pic:cNvPr id="0" name="image11.png"/>
+                    <pic:cNvPr id="0" name="image12.png"/>
                     <pic:cNvPicPr preferRelativeResize="0"/>
                   </pic:nvPicPr>
                   <pic:blipFill>
@@ -9825,12 +9825,12 @@
           <wp:inline distB="114300" distT="114300" distL="114300" distR="114300">
             <wp:extent cx="6332400" cy="1549400"/>
             <wp:effectExtent b="0" l="0" r="0" t="0"/>
-            <wp:docPr id="11" name="image9.png"/>
+            <wp:docPr id="11" name="image11.png"/>
             <a:graphic>
               <a:graphicData uri="http://schemas.openxmlformats.org/drawingml/2006/picture">
                 <pic:pic>
                   <pic:nvPicPr>
-                    <pic:cNvPr id="0" name="image9.png"/>
+                    <pic:cNvPr id="0" name="image11.png"/>
                     <pic:cNvPicPr preferRelativeResize="0"/>
                   </pic:nvPicPr>
                   <pic:blipFill>
@@ -11685,12 +11685,12 @@
           <wp:inline distB="114300" distT="114300" distL="114300" distR="114300">
             <wp:extent cx="6332400" cy="1117600"/>
             <wp:effectExtent b="0" l="0" r="0" t="0"/>
-            <wp:docPr id="34" name="image27.png"/>
+            <wp:docPr id="34" name="image26.png"/>
             <a:graphic>
               <a:graphicData uri="http://schemas.openxmlformats.org/drawingml/2006/picture">
                 <pic:pic>
                   <pic:nvPicPr>
-                    <pic:cNvPr id="0" name="image27.png"/>
+                    <pic:cNvPr id="0" name="image26.png"/>
                     <pic:cNvPicPr preferRelativeResize="0"/>
                   </pic:nvPicPr>
                   <pic:blipFill>
@@ -11797,12 +11797,12 @@
           <wp:inline distB="114300" distT="114300" distL="114300" distR="114300">
             <wp:extent cx="6332400" cy="4559300"/>
             <wp:effectExtent b="0" l="0" r="0" t="0"/>
-            <wp:docPr id="18" name="image25.png"/>
+            <wp:docPr id="18" name="image27.png"/>
             <a:graphic>
               <a:graphicData uri="http://schemas.openxmlformats.org/drawingml/2006/picture">
                 <pic:pic>
                   <pic:nvPicPr>
-                    <pic:cNvPr id="0" name="image25.png"/>
+                    <pic:cNvPr id="0" name="image27.png"/>
                     <pic:cNvPicPr preferRelativeResize="0"/>
                   </pic:nvPicPr>
                   <pic:blipFill>
@@ -14021,12 +14021,12 @@
           <wp:inline distB="114300" distT="114300" distL="114300" distR="114300">
             <wp:extent cx="6332400" cy="2514600"/>
             <wp:effectExtent b="0" l="0" r="0" t="0"/>
-            <wp:docPr id="29" name="image23.png"/>
+            <wp:docPr id="29" name="image24.png"/>
             <a:graphic>
               <a:graphicData uri="http://schemas.openxmlformats.org/drawingml/2006/picture">
                 <pic:pic>
                   <pic:nvPicPr>
-                    <pic:cNvPr id="0" name="image23.png"/>
+                    <pic:cNvPr id="0" name="image24.png"/>
                     <pic:cNvPicPr preferRelativeResize="0"/>
                   </pic:nvPicPr>
                   <pic:blipFill>
@@ -14171,24 +14171,6 @@
     </w:p>
     <w:p>
       <w:pPr>
-        <w:spacing w:after="200" w:line="276" w:lineRule="auto"/>
-        <w:ind w:firstLine="720"/>
-        <w:jc w:val="center"/>
-        <w:rPr>
-          <w:b w:val="1"/>
-          <w:bCs w:val="1"/>
-          <w:sz w:val="24"/>
-          <w:szCs w:val="24"/>
-        </w:rPr>
-      </w:pPr>
-      <w:r>
-        <w:rPr>
-          <w:rtl w:val="0"/>
-        </w:rPr>
-      </w:r>
-    </w:p>
-    <w:p>
-      <w:pPr>
         <w:spacing w:after="160" w:line="276" w:lineRule="auto"/>
         <w:rPr>
           <w:sz w:val="22"/>
@@ -14216,6 +14198,43 @@
     </w:p>
     <w:p>
       <w:pPr>
+        <w:spacing w:after="160" w:line="276" w:lineRule="auto"/>
+        <w:jc w:val="both"/>
+        <w:rPr>
+          <w:sz w:val="24"/>
+          <w:szCs w:val="24"/>
+        </w:rPr>
+      </w:pPr>
+      <w:r>
+        <w:rPr>
+          <w:b w:val="1"/>
+          <w:bCs w:val="1"/>
+          <w:sz w:val="22"/>
+          <w:szCs w:val="22"/>
+          <w:rtl w:val="0"/>
+        </w:rPr>
+        <w:t xml:space="preserve">Nota:</w:t>
+      </w:r>
+      <w:r>
+        <w:rPr>
+          <w:sz w:val="22"/>
+          <w:szCs w:val="22"/>
+          <w:rtl w:val="0"/>
+        </w:rPr>
+        <w:t xml:space="preserve"> </w:t>
+      </w:r>
+      <w:r>
+        <w:rPr>
+          <w:rFonts w:ascii="Cardo" w:cs="Cardo" w:eastAsia="Cardo" w:hAnsi="Cardo"/>
+          <w:sz w:val="24"/>
+          <w:szCs w:val="24"/>
+          <w:rtl w:val="0"/>
+        </w:rPr>
+        <w:t xml:space="preserve">Para efectos de claridad y simplicidad en la documentación del sistema, se modela el flujo correspondiente a la operación 'Agregar Nueva Alarma' por ser el escenario principal y de mayor complejidad del Caso de Uso 3.5. Las acciones de 'Eliminar' y 'Modificar Estado' se omiten en las gráficas dado que comparten exactamente la misma topología y secuencia de comunicación entre las capas de la arquitectura (Interfaz → Fachada Servicio → Repositorio Persistencia). </w:t>
+      </w:r>
+    </w:p>
+    <w:p>
+      <w:pPr>
         <w:spacing w:after="40" w:lineRule="auto"/>
         <w:ind w:left="720" w:firstLine="0"/>
         <w:jc w:val="both"/>
@@ -14275,12 +14294,12 @@
           <wp:inline distB="114300" distT="114300" distL="114300" distR="114300">
             <wp:extent cx="3019425" cy="1438275"/>
             <wp:effectExtent b="0" l="0" r="0" t="0"/>
-            <wp:docPr id="32" name="image19.png"/>
+            <wp:docPr id="32" name="image23.png"/>
             <a:graphic>
               <a:graphicData uri="http://schemas.openxmlformats.org/drawingml/2006/picture">
                 <pic:pic>
                   <pic:nvPicPr>
-                    <pic:cNvPr id="0" name="image19.png"/>
+                    <pic:cNvPr id="0" name="image23.png"/>
                     <pic:cNvPicPr preferRelativeResize="0"/>
                   </pic:nvPicPr>
                   <pic:blipFill>
@@ -15418,12 +15437,12 @@
           <wp:inline distB="114300" distT="114300" distL="114300" distR="114300">
             <wp:extent cx="6478093" cy="924037"/>
             <wp:effectExtent b="0" l="0" r="0" t="0"/>
-            <wp:docPr id="10" name="image17.png"/>
+            <wp:docPr id="10" name="image19.png"/>
             <a:graphic>
               <a:graphicData uri="http://schemas.openxmlformats.org/drawingml/2006/picture">
                 <pic:pic>
                   <pic:nvPicPr>
-                    <pic:cNvPr id="0" name="image17.png"/>
+                    <pic:cNvPr id="0" name="image19.png"/>
                     <pic:cNvPicPr preferRelativeResize="0"/>
                   </pic:nvPicPr>
                   <pic:blipFill>
@@ -15527,12 +15546,12 @@
           <wp:inline distB="114300" distT="114300" distL="114300" distR="114300">
             <wp:extent cx="6332400" cy="4559300"/>
             <wp:effectExtent b="0" l="0" r="0" t="0"/>
-            <wp:docPr id="6" name="image26.png"/>
+            <wp:docPr id="6" name="image28.png"/>
             <a:graphic>
               <a:graphicData uri="http://schemas.openxmlformats.org/drawingml/2006/picture">
                 <pic:pic>
                   <pic:nvPicPr>
-                    <pic:cNvPr id="0" name="image26.png"/>
+                    <pic:cNvPr id="0" name="image28.png"/>
                     <pic:cNvPicPr preferRelativeResize="0"/>
                   </pic:nvPicPr>
                   <pic:blipFill>
@@ -15665,12 +15684,12 @@
           <wp:inline distB="114300" distT="114300" distL="114300" distR="114300">
             <wp:extent cx="6332400" cy="2857500"/>
             <wp:effectExtent b="0" l="0" r="0" t="0"/>
-            <wp:docPr id="20" name="image2.png"/>
+            <wp:docPr id="20" name="image8.png"/>
             <a:graphic>
               <a:graphicData uri="http://schemas.openxmlformats.org/drawingml/2006/picture">
                 <pic:pic>
                   <pic:nvPicPr>
-                    <pic:cNvPr id="0" name="image2.png"/>
+                    <pic:cNvPr id="0" name="image8.png"/>
                     <pic:cNvPicPr preferRelativeResize="0"/>
                   </pic:nvPicPr>
                   <pic:blipFill>
@@ -15799,12 +15818,12 @@
           <wp:inline distB="114300" distT="114300" distL="114300" distR="114300">
             <wp:extent cx="2235807" cy="3752962"/>
             <wp:effectExtent b="0" l="0" r="0" t="0"/>
-            <wp:docPr id="7" name="image28.png"/>
+            <wp:docPr id="7" name="image13.png"/>
             <a:graphic>
               <a:graphicData uri="http://schemas.openxmlformats.org/drawingml/2006/picture">
                 <pic:pic>
                   <pic:nvPicPr>
-                    <pic:cNvPr id="0" name="image28.png"/>
+                    <pic:cNvPr id="0" name="image13.png"/>
                     <pic:cNvPicPr preferRelativeResize="0"/>
                   </pic:nvPicPr>
                   <pic:blipFill>
@@ -18794,12 +18813,12 @@
           <wp:inline distB="114300" distT="114300" distL="114300" distR="114300">
             <wp:extent cx="3508314" cy="2914762"/>
             <wp:effectExtent b="0" l="0" r="0" t="0"/>
-            <wp:docPr id="23" name="image16.png"/>
+            <wp:docPr id="23" name="image10.png"/>
             <a:graphic>
               <a:graphicData uri="http://schemas.openxmlformats.org/drawingml/2006/picture">
                 <pic:pic>
                   <pic:nvPicPr>
-                    <pic:cNvPr id="0" name="image16.png"/>
+                    <pic:cNvPr id="0" name="image10.png"/>
                     <pic:cNvPicPr preferRelativeResize="0"/>
                   </pic:nvPicPr>
                   <pic:blipFill>
@@ -19845,12 +19864,12 @@
           <wp:inline distB="114300" distT="114300" distL="114300" distR="114300">
             <wp:extent cx="5731200" cy="4025900"/>
             <wp:effectExtent b="0" l="0" r="0" t="0"/>
-            <wp:docPr id="9" name="image1.png"/>
+            <wp:docPr id="9" name="image2.png"/>
             <a:graphic>
               <a:graphicData uri="http://schemas.openxmlformats.org/drawingml/2006/picture">
                 <pic:pic>
                   <pic:nvPicPr>
-                    <pic:cNvPr id="0" name="image1.png"/>
+                    <pic:cNvPr id="0" name="image2.png"/>
                     <pic:cNvPicPr preferRelativeResize="0"/>
                   </pic:nvPicPr>
                   <pic:blipFill>
@@ -23348,12 +23367,12 @@
           <wp:inline distB="114300" distT="114300" distL="114300" distR="114300">
             <wp:extent cx="3910013" cy="2706932"/>
             <wp:effectExtent b="0" l="0" r="0" t="0"/>
-            <wp:docPr id="31" name="image24.png"/>
+            <wp:docPr id="31" name="image17.png"/>
             <a:graphic>
               <a:graphicData uri="http://schemas.openxmlformats.org/drawingml/2006/picture">
                 <pic:pic>
                   <pic:nvPicPr>
-                    <pic:cNvPr id="0" name="image24.png"/>
+                    <pic:cNvPr id="0" name="image17.png"/>
                     <pic:cNvPicPr preferRelativeResize="0"/>
                   </pic:nvPicPr>
                   <pic:blipFill>
@@ -23534,12 +23553,12 @@
           <wp:inline distB="114300" distT="114300" distL="114300" distR="114300">
             <wp:extent cx="6332400" cy="2590800"/>
             <wp:effectExtent b="0" l="0" r="0" t="0"/>
-            <wp:docPr id="2" name="image8.png"/>
+            <wp:docPr id="2" name="image5.png"/>
             <a:graphic>
               <a:graphicData uri="http://schemas.openxmlformats.org/drawingml/2006/picture">
                 <pic:pic>
                   <pic:nvPicPr>
-                    <pic:cNvPr id="0" name="image8.png"/>
+                    <pic:cNvPr id="0" name="image5.png"/>
                     <pic:cNvPicPr preferRelativeResize="0"/>
                   </pic:nvPicPr>
                   <pic:blipFill>
@@ -24962,12 +24981,12 @@
           <wp:inline distB="114300" distT="114300" distL="114300" distR="114300">
             <wp:extent cx="6068288" cy="1788548"/>
             <wp:effectExtent b="0" l="0" r="0" t="0"/>
-            <wp:docPr id="26" name="image12.png"/>
+            <wp:docPr id="26" name="image20.png"/>
             <a:graphic>
               <a:graphicData uri="http://schemas.openxmlformats.org/drawingml/2006/picture">
                 <pic:pic>
                   <pic:nvPicPr>
-                    <pic:cNvPr id="0" name="image12.png"/>
+                    <pic:cNvPr id="0" name="image20.png"/>
                     <pic:cNvPicPr preferRelativeResize="0"/>
                   </pic:nvPicPr>
                   <pic:blipFill>
@@ -25105,12 +25124,12 @@
           <wp:inline distB="114300" distT="114300" distL="114300" distR="114300">
             <wp:extent cx="4743450" cy="2856004"/>
             <wp:effectExtent b="0" l="0" r="0" t="0"/>
-            <wp:docPr id="5" name="image10.png"/>
+            <wp:docPr id="5" name="image1.png"/>
             <a:graphic>
               <a:graphicData uri="http://schemas.openxmlformats.org/drawingml/2006/picture">
                 <pic:pic>
                   <pic:nvPicPr>
-                    <pic:cNvPr id="0" name="image10.png"/>
+                    <pic:cNvPr id="0" name="image1.png"/>
                     <pic:cNvPicPr preferRelativeResize="0"/>
                   </pic:nvPicPr>
                   <pic:blipFill>
@@ -26238,12 +26257,12 @@
           <wp:inline distB="114300" distT="114300" distL="114300" distR="114300">
             <wp:extent cx="6332400" cy="3289300"/>
             <wp:effectExtent b="0" l="0" r="0" t="0"/>
-            <wp:docPr id="28" name="image15.png"/>
+            <wp:docPr id="28" name="image22.png"/>
             <a:graphic>
               <a:graphicData uri="http://schemas.openxmlformats.org/drawingml/2006/picture">
                 <pic:pic>
                   <pic:nvPicPr>
-                    <pic:cNvPr id="0" name="image15.png"/>
+                    <pic:cNvPr id="0" name="image22.png"/>
                     <pic:cNvPicPr preferRelativeResize="0"/>
                   </pic:nvPicPr>
                   <pic:blipFill>

</xml_diff>